<commit_message>
CN-Lab05-Revision-Notes and CN-Lab06 Manual & Tasks
</commit_message>
<xml_diff>
--- a/Lab-04/CN-Lab04-[24k-0859].docx
+++ b/Lab-04/CN-Lab04-[24k-0859].docx
@@ -19,7 +19,16 @@
           <w:sz w:val="32"/>
           <w:szCs w:val="32"/>
         </w:rPr>
-        <w:t>CN Lab-3</w:t>
+        <w:t>CN Lab-</w:t>
+      </w:r>
+      <w:r>
+        <w:rPr>
+          <w:b/>
+          <w:bCs/>
+          <w:sz w:val="32"/>
+          <w:szCs w:val="32"/>
+        </w:rPr>
+        <w:t>4</w:t>
       </w:r>
     </w:p>
     <w:p>
@@ -1910,7 +1919,23 @@
           <w:bCs/>
         </w:rPr>
         <w:lastRenderedPageBreak/>
-        <w:t>Pointing Every PC’s DNS servers field at Server 0:</w:t>
+        <w:t xml:space="preserve">Pointing Every PC’s DNS </w:t>
+      </w:r>
+      <w:proofErr w:type="gramStart"/>
+      <w:r>
+        <w:rPr>
+          <w:b/>
+          <w:bCs/>
+        </w:rPr>
+        <w:t>servers</w:t>
+      </w:r>
+      <w:proofErr w:type="gramEnd"/>
+      <w:r>
+        <w:rPr>
+          <w:b/>
+          <w:bCs/>
+        </w:rPr>
+        <w:t xml:space="preserve"> field at Server 0:</w:t>
       </w:r>
       <w:r>
         <w:rPr>
@@ -3971,21 +3996,7 @@
         <w:rPr>
           <w:bCs/>
         </w:rPr>
-        <w:t>The PC queried the alias fast-</w:t>
-      </w:r>
-      <w:proofErr w:type="spellStart"/>
-      <w:r>
-        <w:rPr>
-          <w:bCs/>
-        </w:rPr>
-        <w:t>cn</w:t>
-      </w:r>
-      <w:proofErr w:type="spellEnd"/>
-      <w:r>
-        <w:rPr>
-          <w:bCs/>
-        </w:rPr>
-        <w:t>, which the DNS server resolved via the CNAME record to fast, then further resolved fast’s A record to the actual IP address 192.168.1.11</w:t>
+        <w:t>The PC queried the alias fast-cn, which the DNS server resolved via the CNAME record to fast, then further resolved fast’s A record to the actual IP address 192.168.1.11</w:t>
       </w:r>
     </w:p>
     <w:p>
@@ -4759,7 +4770,6 @@
         </w:rPr>
         <w:t xml:space="preserve">The </w:t>
       </w:r>
-      <w:proofErr w:type="spellStart"/>
       <w:r>
         <w:rPr>
           <w:b/>
@@ -4770,14 +4780,7 @@
         <w:rPr>
           <w:b/>
         </w:rPr>
-        <w:t>racert</w:t>
-      </w:r>
-      <w:proofErr w:type="spellEnd"/>
-      <w:r>
-        <w:rPr>
-          <w:b/>
-        </w:rPr>
-        <w:t xml:space="preserve"> output shows the packet first hopping through the router’s interface (192.168.1.1) before reaching the destination PC on the other network (192.168.2.2) </w:t>
+        <w:t xml:space="preserve">racert output shows the packet first hopping through the router’s interface (192.168.1.1) before reaching the destination PC on the other network (192.168.2.2) </w:t>
       </w:r>
       <w:r>
         <w:rPr>

</xml_diff>